<commit_message>
Update deployment doc with GPX tracking section
- Updates nickname bullet to mention server-side persistence (nicknames.json)
- Adds GPX Track Files section covering file naming, folder structure,
  trackpoint contents, nickname rename behaviour, and restart safety
- Includes example folder tree in a code block

Co-Authored-By: Claude Sonnet 4.6 <noreply@anthropic.com>
</commit_message>
<xml_diff>
--- a/Mapper_VPS_Deployment.docx
+++ b/Mapper_VPS_Deployment.docx
@@ -2315,7 +2315,7 @@
           <w:sz w:val="22"/>
           <w:szCs w:val="22"/>
         </w:rPr>
-        <w:t xml:space="preserve">•  Device nicknames — click the pencil icon on any device card to assign a friendly name. Nicknames are saved in the browser’s localStorage and persist across page reloads. The raw device ID remains visible in the map marker popup.</w:t>
+        <w:t xml:space="preserve">•  Device nicknames — click the pencil icon on any device card to assign a friendly name. Nicknames are stored in nicknames.json on the server and synced to the browser on load, so they persist across page reloads and server restarts. The raw device ID remains visible in the map marker popup.</w:t>
       </w:r>
     </w:p>
     <w:p>
@@ -2390,6 +2390,224 @@
                 <w:szCs w:val="18"/>
               </w:rPr>
               <w:t>[2026-04-16 14:23:45] device1 → 51.50123, -0.12345 batt=85% spd=12.3km/h acc=±5m alt=32m</w:t>
+            </w:r>
+          </w:p>
+        </w:tc>
+      </w:tr>
+    </w:tbl>
+    <w:p>
+      <w:pPr>
+        <w:pStyle w:val="Normal"/>
+        <w:spacing w:before="0" w:after="120"/>
+        <w:rPr/>
+      </w:pPr>
+      <w:r>
+        <w:rPr/>
+      </w:r>
+    </w:p>
+    <w:p>
+      <w:pPr>
+        <w:pStyle w:val="Heading1"/>
+        <w:rPr/>
+      </w:pPr>
+      <w:r>
+        <w:rPr/>
+        <w:t>GPX Track Files</w:t>
+      </w:r>
+    </w:p>
+    <w:p>
+      <w:pPr>
+        <w:pStyle w:val="Normal"/>
+        <w:spacing w:before="0" w:after="120"/>
+        <w:rPr/>
+      </w:pPr>
+      <w:r>
+        <w:rPr>
+          <w:rFonts w:eastAsia="Arial" w:cs="Arial"/>
+          <w:sz w:val="22"/>
+          <w:szCs w:val="22"/>
+        </w:rPr>
+        <w:t xml:space="preserve">The server writes a GPX track file for each device, organised by date. Files are created automatically in the gpx/ folder inside the project directory and can be opened in any mapping application (Google Earth, QGIS, Garmin BaseCamp, etc.).</w:t>
+      </w:r>
+    </w:p>
+    <w:p>
+      <w:pPr>
+        <w:pStyle w:val="Normal"/>
+        <w:spacing w:before="0" w:after="80"/>
+        <w:ind w:left="360" w:hanging="200"/>
+        <w:rPr/>
+      </w:pPr>
+      <w:r>
+        <w:rPr>
+          <w:rFonts w:eastAsia="Arial" w:cs="Arial"/>
+          <w:sz w:val="22"/>
+          <w:szCs w:val="22"/>
+        </w:rPr>
+        <w:t xml:space="preserve">•  One file per device per day, stored under gpx/YYYY-MM-DD/.</w:t>
+      </w:r>
+    </w:p>
+    <w:p>
+      <w:pPr>
+        <w:pStyle w:val="Normal"/>
+        <w:spacing w:before="0" w:after="80"/>
+        <w:ind w:left="360" w:hanging="200"/>
+        <w:rPr/>
+      </w:pPr>
+      <w:r>
+        <w:rPr>
+          <w:rFonts w:eastAsia="Arial" w:cs="Arial"/>
+          <w:sz w:val="22"/>
+          <w:szCs w:val="22"/>
+        </w:rPr>
+        <w:t xml:space="preserve">•  Filename format: Nickname - DeviceID.gpx. If no nickname is set, the filename is DeviceID.gpx.</w:t>
+      </w:r>
+    </w:p>
+    <w:p>
+      <w:pPr>
+        <w:pStyle w:val="Normal"/>
+        <w:spacing w:before="0" w:after="80"/>
+        <w:ind w:left="360" w:hanging="200"/>
+        <w:rPr/>
+      </w:pPr>
+      <w:r>
+        <w:rPr>
+          <w:rFonts w:eastAsia="Arial" w:cs="Arial"/>
+          <w:sz w:val="22"/>
+          <w:szCs w:val="22"/>
+        </w:rPr>
+        <w:t xml:space="preserve">•  Each trackpoint includes coordinates, timestamp, and optionally elevation and speed.</w:t>
+      </w:r>
+    </w:p>
+    <w:p>
+      <w:pPr>
+        <w:pStyle w:val="Normal"/>
+        <w:spacing w:before="0" w:after="80"/>
+        <w:ind w:left="360" w:hanging="200"/>
+        <w:rPr/>
+      </w:pPr>
+      <w:r>
+        <w:rPr>
+          <w:rFonts w:eastAsia="Arial" w:cs="Arial"/>
+          <w:sz w:val="22"/>
+          <w:szCs w:val="22"/>
+        </w:rPr>
+        <w:t xml:space="preserve">•  Assigning or changing a nickname renames today’s GPX file automatically.</w:t>
+      </w:r>
+    </w:p>
+    <w:p>
+      <w:pPr>
+        <w:pStyle w:val="Normal"/>
+        <w:spacing w:before="0" w:after="120"/>
+        <w:ind w:left="360" w:hanging="200"/>
+        <w:rPr/>
+      </w:pPr>
+      <w:r>
+        <w:rPr>
+          <w:rFonts w:eastAsia="Arial" w:cs="Arial"/>
+          <w:sz w:val="22"/>
+          <w:szCs w:val="22"/>
+        </w:rPr>
+        <w:t xml:space="preserve">•  Server restarts do not lose track data — existing points are read back from the file on first update of the day.</w:t>
+      </w:r>
+    </w:p>
+    <w:p>
+      <w:pPr>
+        <w:pStyle w:val="Normal"/>
+        <w:spacing w:before="0" w:after="120"/>
+        <w:rPr/>
+      </w:pPr>
+      <w:r>
+        <w:rPr>
+          <w:rFonts w:eastAsia="Arial" w:cs="Arial"/>
+          <w:sz w:val="22"/>
+          <w:szCs w:val="22"/>
+        </w:rPr>
+        <w:t>Example folder structure after two devices have been tracked for one day:</w:t>
+      </w:r>
+    </w:p>
+    <w:tbl>
+      <w:tblPr>
+        <w:tblW w:w="9360" w:type="dxa"/>
+        <w:jc w:val="start"/>
+        <w:tblInd w:w="0" w:type="dxa"/>
+        <w:tblLayout w:type="fixed"/>
+        <w:tblCellMar>
+          <w:top w:w="80" w:type="dxa"/>
+          <w:start w:w="120" w:type="dxa"/>
+          <w:bottom w:w="80" w:type="dxa"/>
+          <w:end w:w="120" w:type="dxa"/>
+        </w:tblCellMar>
+      </w:tblPr>
+      <w:tblGrid>
+        <w:gridCol w:w="9360"/>
+      </w:tblGrid>
+      <w:tr>
+        <w:trPr/>
+        <w:tc>
+          <w:tcPr>
+            <w:tcW w:w="9360" w:type="dxa"/>
+            <w:tcBorders>
+              <w:top w:val="single" w:sz="2" w:space="0" w:color="CCCCCC"/>
+              <w:start w:val="single" w:sz="2" w:space="0" w:color="CCCCCC"/>
+              <w:bottom w:val="single" w:sz="2" w:space="0" w:color="CCCCCC"/>
+              <w:end w:val="single" w:sz="2" w:space="0" w:color="CCCCCC"/>
+            </w:tcBorders>
+            <w:shd w:fill="F2F2F2" w:val="clear"/>
+          </w:tcPr>
+          <w:p>
+            <w:pPr>
+              <w:pStyle w:val="Normal"/>
+              <w:rPr/>
+            </w:pPr>
+            <w:r>
+              <w:rPr>
+                <w:rFonts w:eastAsia="Courier New" w:cs="Courier New" w:ascii="Courier New" w:hAnsi="Courier New"/>
+                <w:sz w:val="18"/>
+                <w:szCs w:val="18"/>
+              </w:rPr>
+              <w:t>gpx/</w:t>
+            </w:r>
+          </w:p>
+          <w:p>
+            <w:pPr>
+              <w:pStyle w:val="Normal"/>
+              <w:rPr/>
+            </w:pPr>
+            <w:r>
+              <w:rPr>
+                <w:rFonts w:eastAsia="Courier New" w:cs="Courier New" w:ascii="Courier New" w:hAnsi="Courier New"/>
+                <w:sz w:val="18"/>
+                <w:szCs w:val="18"/>
+              </w:rPr>
+              <w:t xml:space="preserve">  2026-04-16/</w:t>
+            </w:r>
+          </w:p>
+          <w:p>
+            <w:pPr>
+              <w:pStyle w:val="Normal"/>
+              <w:rPr/>
+            </w:pPr>
+            <w:r>
+              <w:rPr>
+                <w:rFonts w:eastAsia="Courier New" w:cs="Courier New" w:ascii="Courier New" w:hAnsi="Courier New"/>
+                <w:sz w:val="18"/>
+                <w:szCs w:val="18"/>
+              </w:rPr>
+              <w:t xml:space="preserve">    Phil - ABC123.gpx</w:t>
+            </w:r>
+          </w:p>
+          <w:p>
+            <w:pPr>
+              <w:pStyle w:val="Normal"/>
+              <w:rPr/>
+            </w:pPr>
+            <w:r>
+              <w:rPr>
+                <w:rFonts w:eastAsia="Courier New" w:cs="Courier New" w:ascii="Courier New" w:hAnsi="Courier New"/>
+                <w:sz w:val="18"/>
+                <w:szCs w:val="18"/>
+              </w:rPr>
+              <w:t xml:space="preserve">    Jane - XYZ789.gpx</w:t>
             </w:r>
           </w:p>
         </w:tc>

</xml_diff>

<commit_message>
Add per-device track colour picker and visibility checkbox
Each device card now shows a checkbox (show/hide the GPS track) and a
colour swatch (<input type=color>) so users can customise track colours.
Both settings are persisted in localStorage and survive page reloads.
Hidden devices continue to accumulate points in storedTracks so the
full track appears immediately when re-shown.

Co-Authored-By: Claude Sonnet 4.6 <noreply@anthropic.com>
</commit_message>
<xml_diff>
--- a/Mapper_VPS_Deployment.docx
+++ b/Mapper_VPS_Deployment.docx
@@ -2621,6 +2621,177 @@
       </w:pPr>
       <w:r>
         <w:rPr/>
+      </w:r>
+    </w:p>
+    <w:p>
+      <w:pPr>
+        <w:pStyle w:val="Heading1"/>
+        <w:spacing w:before="400" w:after="120"/>
+      </w:pPr>
+      <w:r>
+        <w:t>Known Issues &amp; Fixes</w:t>
+      </w:r>
+    </w:p>
+    <w:p>
+      <w:pPr>
+        <w:pStyle w:val="Heading2"/>
+        <w:spacing w:before="280" w:after="80"/>
+      </w:pPr>
+      <w:r>
+        <w:t>Issue 1 — GPS Track Not Loading on Page Refresh</w:t>
+      </w:r>
+    </w:p>
+    <w:p>
+      <w:pPr>
+        <w:pStyle w:val="Normal"/>
+        <w:spacing w:before="0" w:after="80"/>
+      </w:pPr>
+      <w:r>
+        <w:rPr>
+          <w:b/>
+        </w:rPr>
+        <w:t xml:space="preserve">Symptom: </w:t>
+      </w:r>
+      <w:r>
+        <w:t>After refreshing the browser, the map showed device markers but no historical track polylines or dots for the day.</w:t>
+      </w:r>
+    </w:p>
+    <w:p>
+      <w:pPr>
+        <w:pStyle w:val="Normal"/>
+        <w:spacing w:before="0" w:after="80"/>
+      </w:pPr>
+      <w:r>
+        <w:rPr>
+          <w:b/>
+        </w:rPr>
+        <w:t xml:space="preserve">Root Cause: </w:t>
+      </w:r>
+      <w:r>
+        <w:t>The browser called GET /tracks via HTTP twice (once on page load, once in ws.onopen). These two async fetches raced with each other and with incoming WebSocket messages. If the server returned an empty result for any reason, the map silently stayed blank with no error shown.</w:t>
+      </w:r>
+    </w:p>
+    <w:p>
+      <w:pPr>
+        <w:pStyle w:val="Normal"/>
+        <w:spacing w:before="0" w:after="120"/>
+      </w:pPr>
+      <w:r>
+        <w:rPr>
+          <w:b/>
+        </w:rPr>
+        <w:t xml:space="preserve">Fix: </w:t>
+      </w:r>
+      <w:r>
+        <w:t>Removed the HTTP fetch entirely. The server now calls getTodayTracks() on every new WebSocket connection and sends one “track” message per device. The browser handles type===“track” with loadTrack(). A single connection delivers everything atomically with no race condition. GET /tracks is kept for diagnostics only.</w:t>
+      </w:r>
+    </w:p>
+    <w:p>
+      <w:pPr>
+        <w:pStyle w:val="Heading2"/>
+        <w:spacing w:before="280" w:after="80"/>
+      </w:pPr>
+      <w:r>
+        <w:t>Issue 2 — Device Card Missing from Sidebar After Server Restart</w:t>
+      </w:r>
+    </w:p>
+    <w:p>
+      <w:pPr>
+        <w:pStyle w:val="Normal"/>
+        <w:spacing w:before="0" w:after="80"/>
+      </w:pPr>
+      <w:r>
+        <w:rPr>
+          <w:b/>
+        </w:rPr>
+        <w:t xml:space="preserve">Symptom: </w:t>
+      </w:r>
+      <w:r>
+        <w:t>After restarting the server with pm2 restart mapper, refreshing the browser showed GPS tracks on the map but no device cards in the left sidebar.</w:t>
+      </w:r>
+    </w:p>
+    <w:p>
+      <w:pPr>
+        <w:pStyle w:val="Normal"/>
+        <w:spacing w:before="0" w:after="80"/>
+      </w:pPr>
+      <w:r>
+        <w:rPr>
+          <w:b/>
+        </w:rPr>
+        <w:t xml:space="preserve">Root Cause: </w:t>
+      </w:r>
+      <w:r>
+        <w:t>The sidebar is populated from “location” WebSocket messages sent from the in-memory devices Map. This Map is empty after a restart because it is only populated by live GPS pings. GPX files are loaded by preloadTodayTracks() into the trackpoints Map but the devices Map was never restored from disk.</w:t>
+      </w:r>
+    </w:p>
+    <w:p>
+      <w:pPr>
+        <w:pStyle w:val="Normal"/>
+        <w:spacing w:before="0" w:after="120"/>
+      </w:pPr>
+      <w:r>
+        <w:rPr>
+          <w:b/>
+        </w:rPr>
+        <w:t xml:space="preserve">Fix: </w:t>
+      </w:r>
+      <w:r>
+        <w:t>preloadTodayTracks() now also populates the devices Map with each device’s last known position from the GPX file. Location WS messages are then sent on connect even after a restart, so the sidebar populates correctly.</w:t>
+      </w:r>
+    </w:p>
+    <w:p>
+      <w:pPr>
+        <w:pStyle w:val="Heading2"/>
+        <w:spacing w:before="280" w:after="80"/>
+      </w:pPr>
+      <w:r>
+        <w:t>Issue 3 — Second Device Data Not Saved (GPX File Missing)</w:t>
+      </w:r>
+    </w:p>
+    <w:p>
+      <w:pPr>
+        <w:pStyle w:val="Normal"/>
+        <w:spacing w:before="0" w:after="80"/>
+      </w:pPr>
+      <w:r>
+        <w:rPr>
+          <w:b/>
+        </w:rPr>
+        <w:t xml:space="preserve">Symptom: </w:t>
+      </w:r>
+      <w:r>
+        <w:t>With two devices active, only the first device had a GPX file created. The second device appeared briefly in the sidebar from live WebSocket messages but disappeared on page refresh and had no track saved.</w:t>
+      </w:r>
+    </w:p>
+    <w:p>
+      <w:pPr>
+        <w:pStyle w:val="Normal"/>
+        <w:spacing w:before="0" w:after="80"/>
+      </w:pPr>
+      <w:r>
+        <w:rPr>
+          <w:b/>
+        </w:rPr>
+        <w:t xml:space="preserve">Root Cause: </w:t>
+      </w:r>
+      <w:r>
+        <w:t>In addTrackpoint(), the code called loadExistingPoints(deviceId, date) on the first GPS ping for any new device. This function was referenced but never defined — it was lost during a previous rewrite. For device 1, preloadTodayTracks() had already populated the trackpoints Map so the call was never reached. For device 2, the call threw ReferenceError: loadExistingPoints is not defined, Express caught it and returned HTTP 500, and no GPX was written.</w:t>
+      </w:r>
+    </w:p>
+    <w:p>
+      <w:pPr>
+        <w:pStyle w:val="Normal"/>
+        <w:spacing w:before="0" w:after="120"/>
+      </w:pPr>
+      <w:r>
+        <w:rPr>
+          <w:b/>
+        </w:rPr>
+        <w:t xml:space="preserve">Fix: </w:t>
+      </w:r>
+      <w:r>
+        <w:t>Defined the missing loadExistingPoints(deviceId, date) function. It reads the existing GPX file for a device on a given date, parses all trackpoints, and returns them as an array. Returns an empty array if the file does not exist. This ensures mid-day server restarts do not lose earlier points for any device.</w:t>
       </w:r>
     </w:p>
     <w:sectPr>

</xml_diff>